<commit_message>
chore: 更新DOCX — 3图重绘+13.2ASCII消除
</commit_message>
<xml_diff>
--- a/04-changes/20260514-AI技术体系架构/AI技术体系架构设计方案.docx
+++ b/04-changes/20260514-AI技术体系架构/AI技术体系架构设计方案.docx
@@ -3578,7 +3578,7 @@
       <w:r>
         <w:drawing>
           <wp:inline>
-            <wp:extent cx="5334000" cy="2222500"/>
+            <wp:extent cx="5334000" cy="3778250"/>
             <wp:effectExtent b="0" l="0" r="0" t="0"/>
             <wp:docPr descr="请求链路全景" title="" id="25" name="Picture"/>
             <a:graphic>
@@ -3599,7 +3599,7 @@
                   <pic:spPr bwMode="auto">
                     <a:xfrm>
                       <a:off x="0" y="0"/>
-                      <a:ext cx="5334000" cy="2222500"/>
+                      <a:ext cx="5334000" cy="3778250"/>
                     </a:xfrm>
                     <a:prstGeom prst="rect">
                       <a:avLst/>
@@ -9888,14 +9888,14 @@
       <w:r>
         <w:drawing>
           <wp:inline>
-            <wp:extent cx="4216400" cy="9880600"/>
+            <wp:extent cx="5334000" cy="2222500"/>
             <wp:effectExtent b="0" l="0" r="0" t="0"/>
-            <wp:docPr descr="Mermaid state diagram" title="" id="87" name="Picture"/>
+            <wp:docPr descr="Agent 生命周期状态机" title="" id="87" name="Picture"/>
             <a:graphic>
               <a:graphicData uri="http://schemas.openxmlformats.org/drawingml/2006/picture">
                 <pic:pic>
                   <pic:nvPicPr>
-                    <pic:cNvPr descr="images/mermaid-state-01.png" id="88" name="Picture"/>
+                    <pic:cNvPr descr="images/fw-arch-20-agent-lifecycle.png" id="88" name="Picture"/>
                     <pic:cNvPicPr>
                       <a:picLocks noChangeArrowheads="1" noChangeAspect="1"/>
                     </pic:cNvPicPr>
@@ -9909,7 +9909,7 @@
                   <pic:spPr bwMode="auto">
                     <a:xfrm>
                       <a:off x="0" y="0"/>
-                      <a:ext cx="4216400" cy="9880600"/>
+                      <a:ext cx="5334000" cy="2222500"/>
                     </a:xfrm>
                     <a:prstGeom prst="rect">
                       <a:avLst/>
@@ -9933,7 +9933,13 @@
         <w:pStyle w:val="ImageCaption"/>
       </w:pPr>
       <w:r>
-        <w:t xml:space="preserve">Mermaid state diagram</w:t>
+        <w:t xml:space="preserve">Agent </w:t>
+      </w:r>
+      <w:r>
+        <w:rPr>
+          <w:rFonts w:hint="eastAsia"/>
+        </w:rPr>
+        <w:t xml:space="preserve">生命周期状态机</w:t>
       </w:r>
     </w:p>
     <w:tbl>
@@ -17659,7 +17665,7 @@
       <w:r>
         <w:drawing>
           <wp:inline>
-            <wp:extent cx="5334000" cy="2889250"/>
+            <wp:extent cx="5334000" cy="2667000"/>
             <wp:effectExtent b="0" l="0" r="0" t="0"/>
             <wp:docPr descr="SaaS 部署拓扑" title="" id="120" name="Picture"/>
             <a:graphic>
@@ -17680,7 +17686,7 @@
                   <pic:spPr bwMode="auto">
                     <a:xfrm>
                       <a:off x="0" y="0"/>
-                      <a:ext cx="5334000" cy="2889250"/>
+                      <a:ext cx="5334000" cy="2667000"/>
                     </a:xfrm>
                     <a:prstGeom prst="rect">
                       <a:avLst/>
@@ -41683,365 +41689,384 @@
     </w:p>
     <w:p>
       <w:pPr>
-        <w:pStyle w:val="SourceCode"/>
+        <w:pStyle w:val="FirstParagraph"/>
       </w:pPr>
       <w:r>
         <w:rPr>
-          <w:rStyle w:val="VerbatimChar"/>
-        </w:rPr>
-        <w:t xml:space="preserve">┌──────────────────────┐     HTTP/gRPC      ┌──────────────────────┐</w:t>
-      </w:r>
-      <w:r>
-        <w:br/>
-      </w:r>
-      <w:r>
-        <w:rPr>
-          <w:rStyle w:val="VerbatimChar"/>
-        </w:rPr>
-        <w:t xml:space="preserve">│   </w:t>
-      </w:r>
-      <w:r>
-        <w:rPr>
-          <w:rStyle w:val="VerbatimChar"/>
-          <w:rFonts w:hint="eastAsia"/>
-        </w:rPr>
-        <w:t xml:space="preserve">企业</w:t>
-      </w:r>
-      <w:r>
-        <w:rPr>
-          <w:rStyle w:val="VerbatimChar"/>
-        </w:rPr>
-        <w:t xml:space="preserve"> Java </w:t>
-      </w:r>
-      <w:r>
-        <w:rPr>
-          <w:rStyle w:val="VerbatimChar"/>
-          <w:rFonts w:hint="eastAsia"/>
+          <w:rFonts w:hint="eastAsia"/>
+          <w:b/>
+          <w:bCs/>
+        </w:rPr>
+        <w:t xml:space="preserve">集成方式：独立</w:t>
+      </w:r>
+      <w:r>
+        <w:rPr>
+          <w:b/>
+          <w:bCs/>
+        </w:rPr>
+        <w:t xml:space="preserve"> Agent </w:t>
+      </w:r>
+      <w:r>
+        <w:rPr>
+          <w:rFonts w:hint="eastAsia"/>
+          <w:b/>
+          <w:bCs/>
+        </w:rPr>
+        <w:t xml:space="preserve">服务</w:t>
+      </w:r>
+      <w:r>
+        <w:rPr>
+          <w:b/>
+          <w:bCs/>
+        </w:rPr>
+        <w:t xml:space="preserve"> + API </w:t>
+      </w:r>
+      <w:r>
+        <w:rPr>
+          <w:rFonts w:hint="eastAsia"/>
+          <w:b/>
+          <w:bCs/>
+        </w:rPr>
+        <w:t xml:space="preserve">网关调用</w:t>
+      </w:r>
+    </w:p>
+    <w:p>
+      <w:pPr>
+        <w:pStyle w:val="Compact"/>
+        <w:numPr>
+          <w:ilvl w:val="0"/>
+          <w:numId w:val="1007"/>
+        </w:numPr>
+      </w:pPr>
+      <w:r>
+        <w:rPr>
+          <w:b/>
+          <w:bCs/>
+        </w:rPr>
+        <w:t xml:space="preserve">Java </w:t>
+      </w:r>
+      <w:r>
+        <w:rPr>
+          <w:rFonts w:hint="eastAsia"/>
+          <w:b/>
+          <w:bCs/>
         </w:rPr>
         <w:t xml:space="preserve">后端</w:t>
       </w:r>
       <w:r>
         <w:rPr>
-          <w:rStyle w:val="VerbatimChar"/>
-        </w:rPr>
-        <w:t xml:space="preserve">       │ ◄────────────────► │   Agent </w:t>
-      </w:r>
-      <w:r>
-        <w:rPr>
-          <w:rStyle w:val="VerbatimChar"/>
-          <w:rFonts w:hint="eastAsia"/>
+          <w:b/>
+          <w:bCs/>
+        </w:rPr>
+        <w:t xml:space="preserve"> (Spring Boot)</w:t>
+      </w:r>
+      <w:r>
+        <w:t xml:space="preserve"> </w:t>
+      </w:r>
+      <w:r>
+        <w:t xml:space="preserve">— </w:t>
+      </w:r>
+      <w:r>
+        <w:rPr>
+          <w:rFonts w:hint="eastAsia"/>
+        </w:rPr>
+        <w:t xml:space="preserve">通过</w:t>
+      </w:r>
+      <w:r>
+        <w:t xml:space="preserve"> HTTP/gRPC </w:t>
+      </w:r>
+      <w:r>
+        <w:rPr>
+          <w:rFonts w:hint="eastAsia"/>
+        </w:rPr>
+        <w:t xml:space="preserve">调用</w:t>
+      </w:r>
+      <w:r>
+        <w:t xml:space="preserve"> Agent </w:t>
+      </w:r>
+      <w:r>
+        <w:rPr>
+          <w:rFonts w:hint="eastAsia"/>
+        </w:rPr>
+        <w:t xml:space="preserve">服务（</w:t>
+      </w:r>
+      <w:r>
+        <w:rPr>
+          <w:rStyle w:val="VerbatimChar"/>
+        </w:rPr>
+        <w:t xml:space="preserve">POST /agent/run</w:t>
+      </w:r>
+      <w:r>
+        <w:t xml:space="preserve">、</w:t>
+      </w:r>
+      <w:r>
+        <w:rPr>
+          <w:rStyle w:val="VerbatimChar"/>
+        </w:rPr>
+        <w:t xml:space="preserve">GET /agent/{id}</w:t>
+      </w:r>
+      <w:r>
+        <w:rPr>
+          <w:rFonts w:hint="eastAsia"/>
+        </w:rPr>
+        <w:t xml:space="preserve">）</w:t>
+      </w:r>
+    </w:p>
+    <w:p>
+      <w:pPr>
+        <w:pStyle w:val="Compact"/>
+        <w:numPr>
+          <w:ilvl w:val="0"/>
+          <w:numId w:val="1007"/>
+        </w:numPr>
+      </w:pPr>
+      <w:r>
+        <w:rPr>
+          <w:b/>
+          <w:bCs/>
+        </w:rPr>
+        <w:t xml:space="preserve">Agent </w:t>
+      </w:r>
+      <w:r>
+        <w:rPr>
+          <w:rFonts w:hint="eastAsia"/>
+          <w:b/>
+          <w:bCs/>
         </w:rPr>
         <w:t xml:space="preserve">服务</w:t>
       </w:r>
       <w:r>
         <w:rPr>
-          <w:rStyle w:val="VerbatimChar"/>
-        </w:rPr>
-        <w:t xml:space="preserve"> (Python) │</w:t>
-      </w:r>
-      <w:r>
-        <w:br/>
-      </w:r>
-      <w:r>
-        <w:rPr>
-          <w:rStyle w:val="VerbatimChar"/>
-        </w:rPr>
-        <w:t xml:space="preserve">│                       │                    │                      │</w:t>
-      </w:r>
-      <w:r>
-        <w:br/>
-      </w:r>
-      <w:r>
-        <w:rPr>
-          <w:rStyle w:val="VerbatimChar"/>
-        </w:rPr>
-        <w:t xml:space="preserve">│  Spring Boot / K8s    │   POST /agent/run  │   LangGraph </w:t>
-      </w:r>
-      <w:r>
-        <w:rPr>
-          <w:rStyle w:val="VerbatimChar"/>
+          <w:b/>
+          <w:bCs/>
+        </w:rPr>
+        <w:t xml:space="preserve"> (Python)</w:t>
+      </w:r>
+      <w:r>
+        <w:t xml:space="preserve"> </w:t>
+      </w:r>
+      <w:r>
+        <w:t xml:space="preserve">— LangGraph </w:t>
+      </w:r>
+      <w:r>
+        <w:rPr>
           <w:rFonts w:hint="eastAsia"/>
         </w:rPr>
         <w:t xml:space="preserve">编排引擎</w:t>
       </w:r>
       <w:r>
-        <w:rPr>
-          <w:rStyle w:val="VerbatimChar"/>
-        </w:rPr>
-        <w:t xml:space="preserve">   │</w:t>
-      </w:r>
-      <w:r>
-        <w:br/>
-      </w:r>
-      <w:r>
-        <w:rPr>
-          <w:rStyle w:val="VerbatimChar"/>
-        </w:rPr>
-        <w:t xml:space="preserve">│  </w:t>
-      </w:r>
-      <w:r>
-        <w:rPr>
-          <w:rStyle w:val="VerbatimChar"/>
-          <w:rFonts w:hint="eastAsia"/>
-        </w:rPr>
-        <w:t xml:space="preserve">业务逻辑</w:t>
-      </w:r>
-      <w:r>
-        <w:rPr>
-          <w:rStyle w:val="VerbatimChar"/>
-        </w:rPr>
         <w:t xml:space="preserve"> + </w:t>
       </w:r>
       <w:r>
         <w:rPr>
-          <w:rStyle w:val="VerbatimChar"/>
-          <w:rFonts w:hint="eastAsia"/>
-        </w:rPr>
-        <w:t xml:space="preserve">数据库</w:t>
-      </w:r>
-      <w:r>
-        <w:rPr>
-          <w:rStyle w:val="VerbatimChar"/>
-        </w:rPr>
-        <w:t xml:space="preserve">     │   GET  /agent/{id} │   </w:t>
-      </w:r>
-      <w:r>
-        <w:rPr>
-          <w:rStyle w:val="VerbatimChar"/>
           <w:rFonts w:hint="eastAsia"/>
         </w:rPr>
         <w:t xml:space="preserve">模型网关</w:t>
       </w:r>
       <w:r>
-        <w:rPr>
-          <w:rStyle w:val="VerbatimChar"/>
-        </w:rPr>
-        <w:t xml:space="preserve"> + RAG      │</w:t>
-      </w:r>
-      <w:r>
-        <w:br/>
-      </w:r>
-      <w:r>
-        <w:rPr>
-          <w:rStyle w:val="VerbatimChar"/>
-        </w:rPr>
-        <w:t xml:space="preserve">│  </w:t>
-      </w:r>
-      <w:r>
-        <w:rPr>
-          <w:rStyle w:val="VerbatimChar"/>
-          <w:rFonts w:hint="eastAsia"/>
-        </w:rPr>
-        <w:t xml:space="preserve">权限</w:t>
-      </w:r>
-      <w:r>
-        <w:rPr>
-          <w:rStyle w:val="VerbatimChar"/>
-        </w:rPr>
+        <w:t xml:space="preserve"> + RAG + </w:t>
+      </w:r>
+      <w:r>
+        <w:rPr>
+          <w:rFonts w:hint="eastAsia"/>
+        </w:rPr>
+        <w:t xml:space="preserve">技能执行</w:t>
+      </w:r>
+      <w:r>
         <w:t xml:space="preserve"> + </w:t>
       </w:r>
       <w:r>
         <w:rPr>
-          <w:rStyle w:val="VerbatimChar"/>
-          <w:rFonts w:hint="eastAsia"/>
-        </w:rPr>
-        <w:t xml:space="preserve">工作流</w:t>
-      </w:r>
-      <w:r>
-        <w:rPr>
-          <w:rStyle w:val="VerbatimChar"/>
-        </w:rPr>
-        <w:t xml:space="preserve">         │                    │   </w:t>
-      </w:r>
-      <w:r>
-        <w:rPr>
-          <w:rStyle w:val="VerbatimChar"/>
-          <w:rFonts w:hint="eastAsia"/>
-        </w:rPr>
-        <w:t xml:space="preserve">技能执行</w:t>
-      </w:r>
-      <w:r>
-        <w:rPr>
-          <w:rStyle w:val="VerbatimChar"/>
-        </w:rPr>
+          <w:rFonts w:hint="eastAsia"/>
+        </w:rPr>
+        <w:t xml:space="preserve">分层记忆</w:t>
+      </w:r>
+    </w:p>
+    <w:p>
+      <w:pPr>
+        <w:pStyle w:val="Compact"/>
+        <w:numPr>
+          <w:ilvl w:val="0"/>
+          <w:numId w:val="1007"/>
+        </w:numPr>
+      </w:pPr>
+      <w:r>
+        <w:rPr>
+          <w:b/>
+          <w:bCs/>
+        </w:rPr>
+        <w:t xml:space="preserve">Higress Gateway</w:t>
+      </w:r>
+      <w:r>
+        <w:t xml:space="preserve"> </w:t>
+      </w:r>
+      <w:r>
+        <w:t xml:space="preserve">— </w:t>
+      </w:r>
+      <w:r>
+        <w:rPr>
+          <w:rFonts w:hint="eastAsia"/>
+        </w:rPr>
+        <w:t xml:space="preserve">统一流量入口，负责限流、Prompt</w:t>
+      </w:r>
+      <w:r>
+        <w:t xml:space="preserve"> Injection </w:t>
+      </w:r>
+      <w:r>
+        <w:rPr>
+          <w:rFonts w:hint="eastAsia"/>
+        </w:rPr>
+        <w:t xml:space="preserve">检测、灰度发布</w:t>
+      </w:r>
+    </w:p>
+    <w:p>
+      <w:pPr>
+        <w:pStyle w:val="FirstParagraph"/>
+      </w:pPr>
+      <w:r>
+        <w:rPr>
+          <w:rFonts w:hint="eastAsia"/>
+          <w:b/>
+          <w:bCs/>
+        </w:rPr>
+        <w:t xml:space="preserve">完整请求链路：</w:t>
+      </w:r>
+    </w:p>
+    <w:p>
+      <w:pPr>
+        <w:pStyle w:val="BodyText"/>
+      </w:pPr>
+      <w:r>
+        <w:rPr>
+          <w:rFonts w:hint="eastAsia"/>
+        </w:rPr>
+        <w:t xml:space="preserve">用户</w:t>
+      </w:r>
+      <w:r>
+        <w:t xml:space="preserve"> → Java </w:t>
+      </w:r>
+      <w:r>
+        <w:rPr>
+          <w:rFonts w:hint="eastAsia"/>
+        </w:rPr>
+        <w:t xml:space="preserve">后端</w:t>
+      </w:r>
+      <w:r>
+        <w:t xml:space="preserve"> </w:t>
+      </w:r>
+      <w:r>
+        <w:rPr>
+          <w:rFonts w:hint="eastAsia"/>
+        </w:rPr>
+        <w:t xml:space="preserve">(鉴权</w:t>
+      </w:r>
+      <w:r>
         <w:t xml:space="preserve"> + </w:t>
       </w:r>
       <w:r>
         <w:rPr>
-          <w:rStyle w:val="VerbatimChar"/>
-          <w:rFonts w:hint="eastAsia"/>
-        </w:rPr>
-        <w:t xml:space="preserve">记忆</w:t>
-      </w:r>
-      <w:r>
-        <w:rPr>
-          <w:rStyle w:val="VerbatimChar"/>
-        </w:rPr>
-        <w:t xml:space="preserve">     │</w:t>
-      </w:r>
-      <w:r>
-        <w:br/>
-      </w:r>
-      <w:r>
-        <w:rPr>
-          <w:rStyle w:val="VerbatimChar"/>
-        </w:rPr>
-        <w:t xml:space="preserve">└──────────────────────┘                    └──────────────────────┘</w:t>
-      </w:r>
-      <w:r>
-        <w:br/>
-      </w:r>
-      <w:r>
-        <w:br/>
-      </w:r>
-      <w:r>
-        <w:rPr>
-          <w:rStyle w:val="VerbatimChar"/>
-          <w:rFonts w:hint="eastAsia"/>
-        </w:rPr>
-        <w:t xml:space="preserve">完整链路:</w:t>
-      </w:r>
-      <w:r>
-        <w:br/>
-      </w:r>
-      <w:r>
-        <w:br/>
-      </w:r>
-      <w:r>
-        <w:rPr>
-          <w:rStyle w:val="VerbatimChar"/>
-          <w:rFonts w:hint="eastAsia"/>
-        </w:rPr>
-        <w:t xml:space="preserve">用户</w:t>
-      </w:r>
-      <w:r>
-        <w:rPr>
-          <w:rStyle w:val="VerbatimChar"/>
-        </w:rPr>
+          <w:rFonts w:hint="eastAsia"/>
+        </w:rPr>
+        <w:t xml:space="preserve">业务上下文注入)</w:t>
+      </w:r>
+      <w:r>
+        <w:t xml:space="preserve"> → Higress Gateway </w:t>
+      </w:r>
+      <w:r>
+        <w:rPr>
+          <w:rFonts w:hint="eastAsia"/>
+        </w:rPr>
+        <w:t xml:space="preserve">(限流</w:t>
+      </w:r>
+      <w:r>
+        <w:t xml:space="preserve"> + Prompt Injection </w:t>
+      </w:r>
+      <w:r>
+        <w:rPr>
+          <w:rFonts w:hint="eastAsia"/>
+        </w:rPr>
+        <w:t xml:space="preserve">检测</w:t>
+      </w:r>
+      <w:r>
+        <w:t xml:space="preserve"> + </w:t>
+      </w:r>
+      <w:r>
+        <w:rPr>
+          <w:rFonts w:hint="eastAsia"/>
+        </w:rPr>
+        <w:t xml:space="preserve">灰度)</w:t>
+      </w:r>
+      <w:r>
+        <w:t xml:space="preserve"> → Agent Router </w:t>
+      </w:r>
+      <w:r>
+        <w:rPr>
+          <w:rFonts w:hint="eastAsia"/>
+        </w:rPr>
+        <w:t xml:space="preserve">(意图分类</w:t>
+      </w:r>
+      <w:r>
+        <w:t xml:space="preserve"> → </w:t>
+      </w:r>
+      <w:r>
+        <w:rPr>
+          <w:rFonts w:hint="eastAsia"/>
+        </w:rPr>
+        <w:t xml:space="preserve">决策路由)</w:t>
+      </w:r>
+      <w:r>
+        <w:t xml:space="preserve"> → Agent </w:t>
+      </w:r>
+      <w:r>
+        <w:rPr>
+          <w:rFonts w:hint="eastAsia"/>
+        </w:rPr>
+        <w:t xml:space="preserve">服务</w:t>
+      </w:r>
+      <w:r>
+        <w:t xml:space="preserve"> Python (LangGraph </w:t>
+      </w:r>
+      <w:r>
+        <w:rPr>
+          <w:rFonts w:hint="eastAsia"/>
+        </w:rPr>
+        <w:t xml:space="preserve">编排)</w:t>
+      </w:r>
+      <w:r>
         <w:t xml:space="preserve"> → Java </w:t>
       </w:r>
       <w:r>
         <w:rPr>
-          <w:rStyle w:val="VerbatimChar"/>
           <w:rFonts w:hint="eastAsia"/>
         </w:rPr>
         <w:t xml:space="preserve">后端</w:t>
       </w:r>
       <w:r>
-        <w:rPr>
-          <w:rStyle w:val="VerbatimChar"/>
-        </w:rPr>
         <w:t xml:space="preserve"> </w:t>
       </w:r>
       <w:r>
         <w:rPr>
-          <w:rStyle w:val="VerbatimChar"/>
-          <w:rFonts w:hint="eastAsia"/>
-        </w:rPr>
-        <w:t xml:space="preserve">(鉴权+业务上下文注入)</w:t>
-      </w:r>
-      <w:r>
-        <w:br/>
-      </w:r>
-      <w:r>
-        <w:rPr>
-          <w:rStyle w:val="VerbatimChar"/>
-        </w:rPr>
-        <w:t xml:space="preserve">  → Higress Gateway </w:t>
-      </w:r>
-      <w:r>
-        <w:rPr>
-          <w:rStyle w:val="VerbatimChar"/>
-          <w:rFonts w:hint="eastAsia"/>
-        </w:rPr>
-        <w:t xml:space="preserve">(限流+Prompt</w:t>
-      </w:r>
-      <w:r>
-        <w:rPr>
-          <w:rStyle w:val="VerbatimChar"/>
-        </w:rPr>
-        <w:t xml:space="preserve"> </w:t>
-      </w:r>
-      <w:r>
-        <w:rPr>
-          <w:rStyle w:val="VerbatimChar"/>
-          <w:rFonts w:hint="eastAsia"/>
-        </w:rPr>
-        <w:t xml:space="preserve">Injection检测+灰度)</w:t>
-      </w:r>
-      <w:r>
-        <w:br/>
-      </w:r>
-      <w:r>
-        <w:rPr>
-          <w:rStyle w:val="VerbatimChar"/>
-        </w:rPr>
-        <w:t xml:space="preserve">  → Agent Router </w:t>
-      </w:r>
-      <w:r>
-        <w:rPr>
-          <w:rStyle w:val="VerbatimChar"/>
-          <w:rFonts w:hint="eastAsia"/>
-        </w:rPr>
-        <w:t xml:space="preserve">(意图分类→决策路由)</w:t>
-      </w:r>
-      <w:r>
-        <w:br/>
-      </w:r>
-      <w:r>
-        <w:rPr>
-          <w:rStyle w:val="VerbatimChar"/>
-        </w:rPr>
-        <w:t xml:space="preserve">  → Agent </w:t>
-      </w:r>
-      <w:r>
-        <w:rPr>
-          <w:rStyle w:val="VerbatimChar"/>
-          <w:rFonts w:hint="eastAsia"/>
-        </w:rPr>
-        <w:t xml:space="preserve">服务</w:t>
-      </w:r>
-      <w:r>
-        <w:rPr>
-          <w:rStyle w:val="VerbatimChar"/>
-        </w:rPr>
-        <w:t xml:space="preserve"> Python </w:t>
-      </w:r>
-      <w:r>
-        <w:rPr>
-          <w:rStyle w:val="VerbatimChar"/>
-          <w:rFonts w:hint="eastAsia"/>
-        </w:rPr>
-        <w:t xml:space="preserve">(LangGraph编排)</w:t>
-      </w:r>
-      <w:r>
-        <w:br/>
-      </w:r>
-      <w:r>
-        <w:rPr>
-          <w:rStyle w:val="VerbatimChar"/>
-        </w:rPr>
-        <w:t xml:space="preserve">  → Java </w:t>
-      </w:r>
-      <w:r>
-        <w:rPr>
-          <w:rStyle w:val="VerbatimChar"/>
-          <w:rFonts w:hint="eastAsia"/>
-        </w:rPr>
-        <w:t xml:space="preserve">后端</w:t>
-      </w:r>
-      <w:r>
-        <w:rPr>
-          <w:rStyle w:val="VerbatimChar"/>
-        </w:rPr>
-        <w:t xml:space="preserve"> </w:t>
-      </w:r>
-      <w:r>
-        <w:rPr>
-          <w:rStyle w:val="VerbatimChar"/>
-          <w:rFonts w:hint="eastAsia"/>
-        </w:rPr>
-        <w:t xml:space="preserve">(格式化→审计→返回前端)</w:t>
+          <w:rFonts w:hint="eastAsia"/>
+        </w:rPr>
+        <w:t xml:space="preserve">(格式化</w:t>
+      </w:r>
+      <w:r>
+        <w:t xml:space="preserve"> → </w:t>
+      </w:r>
+      <w:r>
+        <w:rPr>
+          <w:rFonts w:hint="eastAsia"/>
+        </w:rPr>
+        <w:t xml:space="preserve">审计</w:t>
+      </w:r>
+      <w:r>
+        <w:t xml:space="preserve"> → </w:t>
+      </w:r>
+      <w:r>
+        <w:rPr>
+          <w:rFonts w:hint="eastAsia"/>
+        </w:rPr>
+        <w:t xml:space="preserve">返回前端)</w:t>
       </w:r>
     </w:p>
     <w:bookmarkEnd w:id="190"/>
@@ -52143,7 +52168,7 @@
         <w:pStyle w:val="Compact"/>
         <w:numPr>
           <w:ilvl w:val="0"/>
-          <w:numId w:val="1007"/>
+          <w:numId w:val="1008"/>
         </w:numPr>
       </w:pPr>
       <w:r>
@@ -52197,7 +52222,7 @@
         <w:pStyle w:val="Compact"/>
         <w:numPr>
           <w:ilvl w:val="0"/>
-          <w:numId w:val="1007"/>
+          <w:numId w:val="1008"/>
         </w:numPr>
       </w:pPr>
       <w:r>
@@ -52226,7 +52251,7 @@
         <w:pStyle w:val="Compact"/>
         <w:numPr>
           <w:ilvl w:val="0"/>
-          <w:numId w:val="1007"/>
+          <w:numId w:val="1008"/>
         </w:numPr>
       </w:pPr>
       <w:r>
@@ -52282,7 +52307,7 @@
         <w:pStyle w:val="Compact"/>
         <w:numPr>
           <w:ilvl w:val="0"/>
-          <w:numId w:val="1007"/>
+          <w:numId w:val="1008"/>
         </w:numPr>
       </w:pPr>
       <w:r>
@@ -52320,7 +52345,7 @@
         <w:pStyle w:val="Compact"/>
         <w:numPr>
           <w:ilvl w:val="0"/>
-          <w:numId w:val="1007"/>
+          <w:numId w:val="1008"/>
         </w:numPr>
       </w:pPr>
       <w:r>
@@ -53023,7 +53048,7 @@
         <w:pStyle w:val="Compact"/>
         <w:numPr>
           <w:ilvl w:val="0"/>
-          <w:numId w:val="1008"/>
+          <w:numId w:val="1009"/>
         </w:numPr>
       </w:pPr>
       <w:r>
@@ -53059,7 +53084,7 @@
         <w:pStyle w:val="Compact"/>
         <w:numPr>
           <w:ilvl w:val="0"/>
-          <w:numId w:val="1008"/>
+          <w:numId w:val="1009"/>
         </w:numPr>
       </w:pPr>
       <w:r>
@@ -53113,7 +53138,7 @@
         <w:pStyle w:val="Compact"/>
         <w:numPr>
           <w:ilvl w:val="0"/>
-          <w:numId w:val="1008"/>
+          <w:numId w:val="1009"/>
         </w:numPr>
       </w:pPr>
       <w:r>
@@ -56390,7 +56415,7 @@
         <w:pStyle w:val="Compact"/>
         <w:numPr>
           <w:ilvl w:val="0"/>
-          <w:numId w:val="1009"/>
+          <w:numId w:val="1010"/>
         </w:numPr>
       </w:pPr>
       <w:r>
@@ -56435,7 +56460,7 @@
         <w:pStyle w:val="Compact"/>
         <w:numPr>
           <w:ilvl w:val="0"/>
-          <w:numId w:val="1009"/>
+          <w:numId w:val="1010"/>
         </w:numPr>
       </w:pPr>
       <w:r>
@@ -70552,6 +70577,9 @@
     <w:abstractNumId w:val="991"/>
   </w:num>
   <w:num w:numId="1007">
+    <w:abstractNumId w:val="991"/>
+  </w:num>
+  <w:num w:numId="1008">
     <w:abstractNumId w:val="99411"/>
     <w:lvlOverride w:ilvl="0">
       <w:startOverride w:val="1"/>
@@ -70581,10 +70609,10 @@
       <w:startOverride w:val="1"/>
     </w:lvlOverride>
   </w:num>
-  <w:num w:numId="1008">
+  <w:num w:numId="1009">
     <w:abstractNumId w:val="991"/>
   </w:num>
-  <w:num w:numId="1009">
+  <w:num w:numId="1010">
     <w:abstractNumId w:val="991"/>
   </w:num>
 </w:numbering>

</xml_diff>